<commit_message>
Modified all lessons DAiE&F&I adn lab 01
</commit_message>
<xml_diff>
--- a/CMA(Computational methods of algebra)/Task CMA 02 KD/Task CMA 02.02-report KD.docx
+++ b/CMA(Computational methods of algebra)/Task CMA 02 KD/Task CMA 02.02-report KD.docx
@@ -3699,7 +3699,13 @@
         <w:t>с диагональным доминированием</w:t>
       </w:r>
       <w:r>
-        <w:t xml:space="preserve"> квадратная матрица </w:t>
+        <w:t xml:space="preserve"> </w:t>
+      </w:r>
+      <w:r>
+        <w:t xml:space="preserve">называется </w:t>
+      </w:r>
+      <w:r>
+        <w:t xml:space="preserve">квадратная матрица </w:t>
       </w:r>
       <w:r>
         <w:rPr>

</xml_diff>